<commit_message>
stílus átformálása, ki és belépés gomb váltakozása
</commit_message>
<xml_diff>
--- a/Dokumentáció.docx
+++ b/Dokumentáció.docx
@@ -41,8 +41,68 @@
       <w:r>
         <w:t>A regisztráció is működik.</w:t>
       </w:r>
+    </w:p>
+    <w:p>
+      <w:r>
+        <w:t xml:space="preserve">Ezután a formázást készítettük elő. Átrendeztük a menüt, hogy több szintű és vízszintes legyen, illetve a </w:t>
+      </w:r>
+      <w:proofErr w:type="spellStart"/>
+      <w:r>
+        <w:t>footer-t</w:t>
+      </w:r>
+      <w:proofErr w:type="spellEnd"/>
+      <w:r>
+        <w:t xml:space="preserve"> beállítottuk, hogy automatikusan a képernyő legalján jelenjen meg, akkor is, ha az oldal nem tölti ki a teljes képernyőt. Illetve a be- és kilépés gombok ne legyenek egyszerre aktívak, hanem csak az aktuális </w:t>
+      </w:r>
+      <w:proofErr w:type="spellStart"/>
+      <w:r>
+        <w:t>bejelentkezettségi</w:t>
+      </w:r>
+      <w:proofErr w:type="spellEnd"/>
+      <w:r>
+        <w:t xml:space="preserve"> állapot alapján. </w:t>
+      </w:r>
       <w:bookmarkStart w:id="0" w:name="_GoBack"/>
       <w:bookmarkEnd w:id="0"/>
+    </w:p>
+    <w:p>
+      <w:r>
+        <w:drawing>
+          <wp:inline distT="0" distB="0" distL="0" distR="0" wp14:anchorId="1EE453E5" wp14:editId="368E59C7">
+            <wp:extent cx="5760720" cy="2727325"/>
+            <wp:effectExtent l="0" t="0" r="0" b="0"/>
+            <wp:docPr id="1" name="Kép 1"/>
+            <wp:cNvGraphicFramePr>
+              <a:graphicFrameLocks xmlns:a="http://schemas.openxmlformats.org/drawingml/2006/main" noChangeAspect="1"/>
+            </wp:cNvGraphicFramePr>
+            <a:graphic xmlns:a="http://schemas.openxmlformats.org/drawingml/2006/main">
+              <a:graphicData uri="http://schemas.openxmlformats.org/drawingml/2006/picture">
+                <pic:pic xmlns:pic="http://schemas.openxmlformats.org/drawingml/2006/picture">
+                  <pic:nvPicPr>
+                    <pic:cNvPr id="1" name=""/>
+                    <pic:cNvPicPr/>
+                  </pic:nvPicPr>
+                  <pic:blipFill>
+                    <a:blip r:embed="rId4"/>
+                    <a:stretch>
+                      <a:fillRect/>
+                    </a:stretch>
+                  </pic:blipFill>
+                  <pic:spPr>
+                    <a:xfrm>
+                      <a:off x="0" y="0"/>
+                      <a:ext cx="5760720" cy="2727325"/>
+                    </a:xfrm>
+                    <a:prstGeom prst="rect">
+                      <a:avLst/>
+                    </a:prstGeom>
+                  </pic:spPr>
+                </pic:pic>
+              </a:graphicData>
+            </a:graphic>
+          </wp:inline>
+        </w:drawing>
+      </w:r>
     </w:p>
     <w:p/>
     <w:sectPr>

</xml_diff>

<commit_message>
Reszponzív menü létrehozása Bootstrap-el.
</commit_message>
<xml_diff>
--- a/Dokumentáció.docx
+++ b/Dokumentáció.docx
@@ -62,11 +62,16 @@
       <w:r>
         <w:t xml:space="preserve"> állapot alapján. </w:t>
       </w:r>
-      <w:bookmarkStart w:id="0" w:name="_GoBack"/>
-      <w:bookmarkEnd w:id="0"/>
+      <w:r>
+        <w:t>Illetve ha valaki bejelentkezett, akkor a jobb felső sarokban egy kis poros ikon, és a név mutatja, hogy be vagyunk jelentkezve</w:t>
+      </w:r>
     </w:p>
     <w:p>
       <w:r>
+        <w:rPr>
+          <w:noProof/>
+          <w:lang w:eastAsia="hu-HU"/>
+        </w:rPr>
         <w:drawing>
           <wp:inline distT="0" distB="0" distL="0" distR="0" wp14:anchorId="1EE453E5" wp14:editId="368E59C7">
             <wp:extent cx="5760720" cy="2727325"/>
@@ -104,7 +109,84 @@
         </w:drawing>
       </w:r>
     </w:p>
-    <w:p/>
+    <w:p>
+      <w:r>
+        <w:t xml:space="preserve">Kis módosítások után a menü szélességet inkább a teljes képernyő szélességéhez igazítottuk, egy minimum 160 </w:t>
+      </w:r>
+      <w:proofErr w:type="spellStart"/>
+      <w:r>
+        <w:t>px-es</w:t>
+      </w:r>
+      <w:proofErr w:type="spellEnd"/>
+      <w:r>
+        <w:t xml:space="preserve"> mérettel, hogy ne nyomódjanak össze véletlenül sem, de ez a későbbiekben a </w:t>
+      </w:r>
+      <w:proofErr w:type="spellStart"/>
+      <w:r>
+        <w:t>reszponzivitás</w:t>
+      </w:r>
+      <w:proofErr w:type="spellEnd"/>
+      <w:r>
+        <w:t xml:space="preserve"> létrehozásánál nem lesz mérvadó probléma. A tartalom részt is a </w:t>
+      </w:r>
+      <w:proofErr w:type="spellStart"/>
+      <w:r>
+        <w:t>footer-hez</w:t>
+      </w:r>
+      <w:proofErr w:type="spellEnd"/>
+      <w:r>
+        <w:t xml:space="preserve"> igazítottuk, hogy egységesen szürke legyen a háttér. Ha </w:t>
+      </w:r>
+      <w:r>
+        <w:t>valaki bejelentkezett, akkor a jobb felső sarokban egy kis poros ikon, és a név mutatja, hogy be vagyunk jelentkezve</w:t>
+      </w:r>
+      <w:r>
+        <w:t>:</w:t>
+      </w:r>
+    </w:p>
+    <w:p>
+      <w:r>
+        <w:drawing>
+          <wp:inline distT="0" distB="0" distL="0" distR="0" wp14:anchorId="419CA0DD" wp14:editId="56C0E2B9">
+            <wp:extent cx="5760720" cy="2713355"/>
+            <wp:effectExtent l="0" t="0" r="0" b="0"/>
+            <wp:docPr id="3" name="Kép 3"/>
+            <wp:cNvGraphicFramePr>
+              <a:graphicFrameLocks xmlns:a="http://schemas.openxmlformats.org/drawingml/2006/main" noChangeAspect="1"/>
+            </wp:cNvGraphicFramePr>
+            <a:graphic xmlns:a="http://schemas.openxmlformats.org/drawingml/2006/main">
+              <a:graphicData uri="http://schemas.openxmlformats.org/drawingml/2006/picture">
+                <pic:pic xmlns:pic="http://schemas.openxmlformats.org/drawingml/2006/picture">
+                  <pic:nvPicPr>
+                    <pic:cNvPr id="1" name=""/>
+                    <pic:cNvPicPr/>
+                  </pic:nvPicPr>
+                  <pic:blipFill>
+                    <a:blip r:embed="rId5"/>
+                    <a:stretch>
+                      <a:fillRect/>
+                    </a:stretch>
+                  </pic:blipFill>
+                  <pic:spPr>
+                    <a:xfrm>
+                      <a:off x="0" y="0"/>
+                      <a:ext cx="5760720" cy="2713355"/>
+                    </a:xfrm>
+                    <a:prstGeom prst="rect">
+                      <a:avLst/>
+                    </a:prstGeom>
+                  </pic:spPr>
+                </pic:pic>
+              </a:graphicData>
+            </a:graphic>
+          </wp:inline>
+        </w:drawing>
+      </w:r>
+    </w:p>
+    <w:p>
+      <w:bookmarkStart w:id="0" w:name="_GoBack"/>
+      <w:bookmarkEnd w:id="0"/>
+    </w:p>
     <w:sectPr>
       <w:pgSz w:w="11906" w:h="16838"/>
       <w:pgMar w:top="1417" w:right="1417" w:bottom="1417" w:left="1417" w:header="708" w:footer="708" w:gutter="0"/>

</xml_diff>

<commit_message>
HTML5 szemantikus elemek javítása:
</commit_message>
<xml_diff>
--- a/Dokumentáció.docx
+++ b/Dokumentáció.docx
@@ -4,7 +4,23 @@
   <w:body>
     <w:p>
       <w:r>
-        <w:t xml:space="preserve">Bemásoltuk az alap projektet, melynél több ponton is hibád észleltünk, mivel nem működtek a linkek, amit azzal javítottunk, hogy néhány helyre „?” karaktert kellett beillesztenünk, mert ugye a fejlesztői környezetben az egy olyan címeket próbált így megnyitni, ami nem létezik. Miután sikerült megoldani a problémát, elindítottuk az XAMPP-ot, és a MySQL admin-on keresztül létrehoztuk az adatbázist a mellékelt SQL fájl alapján. </w:t>
+        <w:t xml:space="preserve">Bemásoltuk az alap projektet, melynél több ponton is hibád észleltünk, mivel nem működtek a linkek, amit azzal javítottunk, hogy néhány helyre „?” karaktert kellett beillesztenünk, mert ugye a fejlesztői környezetben az egy olyan címeket próbált így megnyitni, ami nem létezik. Miután sikerült megoldani a problémát, elindítottuk az XAMPP-ot, és a </w:t>
+      </w:r>
+      <w:proofErr w:type="spellStart"/>
+      <w:r>
+        <w:t>MySQL</w:t>
+      </w:r>
+      <w:proofErr w:type="spellEnd"/>
+      <w:r>
+        <w:t xml:space="preserve"> </w:t>
+      </w:r>
+      <w:proofErr w:type="spellStart"/>
+      <w:r>
+        <w:t>admin-on</w:t>
+      </w:r>
+      <w:proofErr w:type="spellEnd"/>
+      <w:r>
+        <w:t xml:space="preserve"> keresztül létrehoztuk az adatbázist a mellékelt SQL fájl alapján. </w:t>
       </w:r>
       <w:r>
         <w:t>A regisztráció is működik.</w:t>
@@ -12,7 +28,23 @@
     </w:p>
     <w:p>
       <w:r>
-        <w:t xml:space="preserve">Ezután a formázást készítettük elő. Átrendeztük a menüt, hogy több szintű és vízszintes legyen, illetve a footer-t beállítottuk, hogy automatikusan a képernyő legalján jelenjen meg, akkor is, ha az oldal nem tölti ki a teljes képernyőt. Illetve a be- és kilépés gombok ne legyenek egyszerre aktívak, hanem csak az aktuális bejelentkezettségi állapot alapján. </w:t>
+        <w:t xml:space="preserve">Ezután a formázást készítettük elő. Átrendeztük a menüt, hogy több szintű és vízszintes legyen, illetve a </w:t>
+      </w:r>
+      <w:proofErr w:type="spellStart"/>
+      <w:r>
+        <w:t>footer</w:t>
+      </w:r>
+      <w:proofErr w:type="spellEnd"/>
+      <w:r>
+        <w:t xml:space="preserve">-t beállítottuk, hogy automatikusan a képernyő legalján jelenjen meg, akkor is, ha az oldal nem tölti ki a teljes képernyőt. Illetve a be- és kilépés gombok ne legyenek egyszerre aktívak, hanem csak az aktuális </w:t>
+      </w:r>
+      <w:proofErr w:type="spellStart"/>
+      <w:r>
+        <w:t>bejelentkezettségi</w:t>
+      </w:r>
+      <w:proofErr w:type="spellEnd"/>
+      <w:r>
+        <w:t xml:space="preserve"> állapot alapján. </w:t>
       </w:r>
       <w:r>
         <w:t>Illetve ha valaki bejelentkezett, akkor a jobb felső sarokban egy kis poros ikon, és a név mutatja, hogy be vagyunk jelentkezve</w:t>
@@ -63,7 +95,31 @@
     </w:p>
     <w:p>
       <w:r>
-        <w:t xml:space="preserve">Kis módosítások után a menü szélességet inkább a teljes képernyő szélességéhez igazítottuk, egy minimum 160 px-es mérettel, hogy ne nyomódjanak össze véletlenül sem, de ez a későbbiekben a reszponzivitás létrehozásánál nem lesz mérvadó probléma. A tartalom részt is a footer-hez igazítottuk, hogy egységesen szürke legyen a háttér. Ha </w:t>
+        <w:t xml:space="preserve">Kis módosítások után a menü szélességet inkább a teljes képernyő szélességéhez igazítottuk, egy minimum 160 </w:t>
+      </w:r>
+      <w:proofErr w:type="spellStart"/>
+      <w:r>
+        <w:t>px</w:t>
+      </w:r>
+      <w:proofErr w:type="spellEnd"/>
+      <w:r>
+        <w:t xml:space="preserve">-es mérettel, hogy ne nyomódjanak össze véletlenül sem, de ez a későbbiekben a </w:t>
+      </w:r>
+      <w:proofErr w:type="spellStart"/>
+      <w:r>
+        <w:t>reszponzivitás</w:t>
+      </w:r>
+      <w:proofErr w:type="spellEnd"/>
+      <w:r>
+        <w:t xml:space="preserve"> létrehozásánál nem lesz mérvadó probléma. A tartalom részt is a </w:t>
+      </w:r>
+      <w:proofErr w:type="spellStart"/>
+      <w:r>
+        <w:t>footer-hez</w:t>
+      </w:r>
+      <w:proofErr w:type="spellEnd"/>
+      <w:r>
+        <w:t xml:space="preserve"> igazítottuk, hogy egységesen szürke legyen a háttér. Ha </w:t>
       </w:r>
       <w:r>
         <w:t>valaki bejelentkezett, akkor a jobb felső sarokban egy kis poros ikon, és a név mutatja, hogy be vagyunk jelentkezve:</w:t>
@@ -114,7 +170,15 @@
     <w:p>
       <w:r>
         <w:lastRenderedPageBreak/>
-        <w:t>Elkezdtük újra gondolni és az új módosítással, így nem működik most a lenyiló menü kis nézetben</w:t>
+        <w:t xml:space="preserve">Elkezdtük újra gondolni és az új módosítással, így nem működik most a </w:t>
+      </w:r>
+      <w:proofErr w:type="spellStart"/>
+      <w:r>
+        <w:t>lenyiló</w:t>
+      </w:r>
+      <w:proofErr w:type="spellEnd"/>
+      <w:r>
+        <w:t xml:space="preserve"> menü kis nézetben</w:t>
       </w:r>
     </w:p>
     <w:p>
@@ -158,59 +222,169 @@
     </w:p>
     <w:p>
       <w:r>
-        <w:t>A css-ben a display:block volt beállítva és nem display:none, tehát ez lett módisítva:</w:t>
-      </w:r>
-    </w:p>
-    <w:p>
-      <w:pPr>
-        <w:rPr>
-          <w:highlight w:val="yellow"/>
-        </w:rPr>
-      </w:pPr>
-      <w:r>
-        <w:rPr>
-          <w:highlight w:val="yellow"/>
-        </w:rPr>
-        <w:t>media (max-width: 991px) {</w:t>
-      </w:r>
-    </w:p>
-    <w:p>
-      <w:pPr>
-        <w:rPr>
-          <w:highlight w:val="yellow"/>
-        </w:rPr>
-      </w:pPr>
-      <w:r>
-        <w:rPr>
-          <w:highlight w:val="yellow"/>
-        </w:rPr>
-        <w:t>    .second-level-menu,</w:t>
-      </w:r>
-    </w:p>
-    <w:p>
-      <w:pPr>
-        <w:rPr>
-          <w:highlight w:val="yellow"/>
-        </w:rPr>
-      </w:pPr>
-      <w:r>
-        <w:rPr>
-          <w:highlight w:val="yellow"/>
-        </w:rPr>
-        <w:t>    .third-level-menu {</w:t>
-      </w:r>
-    </w:p>
-    <w:p>
-      <w:pPr>
-        <w:rPr>
-          <w:highlight w:val="yellow"/>
-        </w:rPr>
-      </w:pPr>
-      <w:r>
-        <w:rPr>
-          <w:highlight w:val="yellow"/>
-        </w:rPr>
-        <w:t>        position: static;</w:t>
+        <w:t xml:space="preserve">A </w:t>
+      </w:r>
+      <w:proofErr w:type="spellStart"/>
+      <w:r>
+        <w:t>css</w:t>
+      </w:r>
+      <w:proofErr w:type="spellEnd"/>
+      <w:r>
+        <w:t xml:space="preserve">-ben a </w:t>
+      </w:r>
+      <w:proofErr w:type="spellStart"/>
+      <w:r>
+        <w:t>display:block</w:t>
+      </w:r>
+      <w:proofErr w:type="spellEnd"/>
+      <w:r>
+        <w:t xml:space="preserve"> volt beállítva és nem </w:t>
+      </w:r>
+      <w:proofErr w:type="spellStart"/>
+      <w:r>
+        <w:t>display:none</w:t>
+      </w:r>
+      <w:proofErr w:type="spellEnd"/>
+      <w:r>
+        <w:t xml:space="preserve">, tehát ez lett </w:t>
+      </w:r>
+      <w:proofErr w:type="spellStart"/>
+      <w:r>
+        <w:t>módisítva</w:t>
+      </w:r>
+      <w:proofErr w:type="spellEnd"/>
+      <w:r>
+        <w:t>:</w:t>
+      </w:r>
+    </w:p>
+    <w:p>
+      <w:pPr>
+        <w:rPr>
+          <w:highlight w:val="yellow"/>
+        </w:rPr>
+      </w:pPr>
+      <w:proofErr w:type="spellStart"/>
+      <w:r>
+        <w:rPr>
+          <w:highlight w:val="yellow"/>
+        </w:rPr>
+        <w:t>media</w:t>
+      </w:r>
+      <w:proofErr w:type="spellEnd"/>
+      <w:r>
+        <w:rPr>
+          <w:highlight w:val="yellow"/>
+        </w:rPr>
+        <w:t xml:space="preserve"> (</w:t>
+      </w:r>
+      <w:proofErr w:type="spellStart"/>
+      <w:r>
+        <w:rPr>
+          <w:highlight w:val="yellow"/>
+        </w:rPr>
+        <w:t>max-width</w:t>
+      </w:r>
+      <w:proofErr w:type="spellEnd"/>
+      <w:r>
+        <w:rPr>
+          <w:highlight w:val="yellow"/>
+        </w:rPr>
+        <w:t>: 991px) {</w:t>
+      </w:r>
+    </w:p>
+    <w:p>
+      <w:pPr>
+        <w:rPr>
+          <w:highlight w:val="yellow"/>
+        </w:rPr>
+      </w:pPr>
+      <w:r>
+        <w:rPr>
+          <w:highlight w:val="yellow"/>
+        </w:rPr>
+        <w:t>    .</w:t>
+      </w:r>
+      <w:proofErr w:type="spellStart"/>
+      <w:r>
+        <w:rPr>
+          <w:highlight w:val="yellow"/>
+        </w:rPr>
+        <w:t>second-level-menu</w:t>
+      </w:r>
+      <w:proofErr w:type="spellEnd"/>
+      <w:r>
+        <w:rPr>
+          <w:highlight w:val="yellow"/>
+        </w:rPr>
+        <w:t>,</w:t>
+      </w:r>
+    </w:p>
+    <w:p>
+      <w:pPr>
+        <w:rPr>
+          <w:highlight w:val="yellow"/>
+        </w:rPr>
+      </w:pPr>
+      <w:r>
+        <w:rPr>
+          <w:highlight w:val="yellow"/>
+        </w:rPr>
+        <w:t>    .</w:t>
+      </w:r>
+      <w:proofErr w:type="spellStart"/>
+      <w:r>
+        <w:rPr>
+          <w:highlight w:val="yellow"/>
+        </w:rPr>
+        <w:t>third-level-menu</w:t>
+      </w:r>
+      <w:proofErr w:type="spellEnd"/>
+      <w:r>
+        <w:rPr>
+          <w:highlight w:val="yellow"/>
+        </w:rPr>
+        <w:t xml:space="preserve"> {</w:t>
+      </w:r>
+    </w:p>
+    <w:p>
+      <w:pPr>
+        <w:rPr>
+          <w:highlight w:val="yellow"/>
+        </w:rPr>
+      </w:pPr>
+      <w:r>
+        <w:rPr>
+          <w:highlight w:val="yellow"/>
+        </w:rPr>
+        <w:t xml:space="preserve">        </w:t>
+      </w:r>
+      <w:proofErr w:type="spellStart"/>
+      <w:r>
+        <w:rPr>
+          <w:highlight w:val="yellow"/>
+        </w:rPr>
+        <w:t>position</w:t>
+      </w:r>
+      <w:proofErr w:type="spellEnd"/>
+      <w:r>
+        <w:rPr>
+          <w:highlight w:val="yellow"/>
+        </w:rPr>
+        <w:t xml:space="preserve">: </w:t>
+      </w:r>
+      <w:proofErr w:type="spellStart"/>
+      <w:r>
+        <w:rPr>
+          <w:highlight w:val="yellow"/>
+        </w:rPr>
+        <w:t>static</w:t>
+      </w:r>
+      <w:proofErr w:type="spellEnd"/>
+      <w:r>
+        <w:rPr>
+          <w:highlight w:val="yellow"/>
+        </w:rPr>
+        <w:t>;</w:t>
       </w:r>
     </w:p>
     <w:p>
@@ -225,12 +399,14 @@
         </w:rPr>
         <w:t xml:space="preserve">        display: </w:t>
       </w:r>
+      <w:proofErr w:type="spellStart"/>
       <w:r>
         <w:rPr>
           <w:highlight w:val="yellow"/>
         </w:rPr>
         <w:t>block</w:t>
       </w:r>
+      <w:proofErr w:type="spellEnd"/>
       <w:r>
         <w:rPr>
           <w:highlight w:val="yellow"/>
@@ -248,7 +424,21 @@
         <w:rPr>
           <w:highlight w:val="yellow"/>
         </w:rPr>
-        <w:t>        width: 100%;</w:t>
+        <w:t xml:space="preserve">        </w:t>
+      </w:r>
+      <w:proofErr w:type="spellStart"/>
+      <w:r>
+        <w:rPr>
+          <w:highlight w:val="yellow"/>
+        </w:rPr>
+        <w:t>width</w:t>
+      </w:r>
+      <w:proofErr w:type="spellEnd"/>
+      <w:r>
+        <w:rPr>
+          <w:highlight w:val="yellow"/>
+        </w:rPr>
+        <w:t>: 100%;</w:t>
       </w:r>
     </w:p>
     <w:p>
@@ -270,24 +460,60 @@
           <w:highlight w:val="green"/>
         </w:rPr>
       </w:pPr>
-      <w:r>
-        <w:rPr>
-          <w:highlight w:val="green"/>
-        </w:rPr>
-        <w:t>media (max-width: 991px) {</w:t>
-      </w:r>
-    </w:p>
-    <w:p>
-      <w:pPr>
-        <w:rPr>
-          <w:highlight w:val="green"/>
-        </w:rPr>
-      </w:pPr>
-      <w:r>
-        <w:rPr>
-          <w:highlight w:val="green"/>
-        </w:rPr>
-        <w:t>    .second-level-menu,</w:t>
+      <w:proofErr w:type="spellStart"/>
+      <w:r>
+        <w:rPr>
+          <w:highlight w:val="green"/>
+        </w:rPr>
+        <w:t>media</w:t>
+      </w:r>
+      <w:proofErr w:type="spellEnd"/>
+      <w:r>
+        <w:rPr>
+          <w:highlight w:val="green"/>
+        </w:rPr>
+        <w:t xml:space="preserve"> (</w:t>
+      </w:r>
+      <w:proofErr w:type="spellStart"/>
+      <w:r>
+        <w:rPr>
+          <w:highlight w:val="green"/>
+        </w:rPr>
+        <w:t>max-width</w:t>
+      </w:r>
+      <w:proofErr w:type="spellEnd"/>
+      <w:r>
+        <w:rPr>
+          <w:highlight w:val="green"/>
+        </w:rPr>
+        <w:t>: 991px) {</w:t>
+      </w:r>
+    </w:p>
+    <w:p>
+      <w:pPr>
+        <w:rPr>
+          <w:highlight w:val="green"/>
+        </w:rPr>
+      </w:pPr>
+      <w:r>
+        <w:rPr>
+          <w:highlight w:val="green"/>
+        </w:rPr>
+        <w:t>    .</w:t>
+      </w:r>
+      <w:proofErr w:type="spellStart"/>
+      <w:r>
+        <w:rPr>
+          <w:highlight w:val="green"/>
+        </w:rPr>
+        <w:t>second-level-menu</w:t>
+      </w:r>
+      <w:proofErr w:type="spellEnd"/>
+      <w:r>
+        <w:rPr>
+          <w:highlight w:val="green"/>
+        </w:rPr>
+        <w:t>,</w:t>
       </w:r>
     </w:p>
     <w:p>
@@ -301,46 +527,116 @@
           <w:highlight w:val="green"/>
         </w:rPr>
         <w:lastRenderedPageBreak/>
-        <w:t>    .third-level-menu {</w:t>
-      </w:r>
-    </w:p>
-    <w:p>
-      <w:pPr>
-        <w:rPr>
-          <w:highlight w:val="green"/>
-        </w:rPr>
-      </w:pPr>
-      <w:r>
-        <w:rPr>
-          <w:highlight w:val="green"/>
-        </w:rPr>
-        <w:t>        position: static;</w:t>
-      </w:r>
-    </w:p>
-    <w:p>
-      <w:pPr>
-        <w:rPr>
-          <w:highlight w:val="green"/>
-        </w:rPr>
-      </w:pPr>
-      <w:r>
-        <w:rPr>
-          <w:highlight w:val="green"/>
-        </w:rPr>
-        <w:t>        display: none;</w:t>
-      </w:r>
-    </w:p>
-    <w:p>
-      <w:pPr>
-        <w:rPr>
-          <w:highlight w:val="green"/>
-        </w:rPr>
-      </w:pPr>
-      <w:r>
-        <w:rPr>
-          <w:highlight w:val="green"/>
-        </w:rPr>
-        <w:t>        width: 100%;</w:t>
+        <w:t>    .</w:t>
+      </w:r>
+      <w:proofErr w:type="spellStart"/>
+      <w:r>
+        <w:rPr>
+          <w:highlight w:val="green"/>
+        </w:rPr>
+        <w:t>third-level-menu</w:t>
+      </w:r>
+      <w:proofErr w:type="spellEnd"/>
+      <w:r>
+        <w:rPr>
+          <w:highlight w:val="green"/>
+        </w:rPr>
+        <w:t xml:space="preserve"> {</w:t>
+      </w:r>
+    </w:p>
+    <w:p>
+      <w:pPr>
+        <w:rPr>
+          <w:highlight w:val="green"/>
+        </w:rPr>
+      </w:pPr>
+      <w:r>
+        <w:rPr>
+          <w:highlight w:val="green"/>
+        </w:rPr>
+        <w:t xml:space="preserve">        </w:t>
+      </w:r>
+      <w:proofErr w:type="spellStart"/>
+      <w:r>
+        <w:rPr>
+          <w:highlight w:val="green"/>
+        </w:rPr>
+        <w:t>position</w:t>
+      </w:r>
+      <w:proofErr w:type="spellEnd"/>
+      <w:r>
+        <w:rPr>
+          <w:highlight w:val="green"/>
+        </w:rPr>
+        <w:t xml:space="preserve">: </w:t>
+      </w:r>
+      <w:proofErr w:type="spellStart"/>
+      <w:r>
+        <w:rPr>
+          <w:highlight w:val="green"/>
+        </w:rPr>
+        <w:t>static</w:t>
+      </w:r>
+      <w:proofErr w:type="spellEnd"/>
+      <w:r>
+        <w:rPr>
+          <w:highlight w:val="green"/>
+        </w:rPr>
+        <w:t>;</w:t>
+      </w:r>
+    </w:p>
+    <w:p>
+      <w:pPr>
+        <w:rPr>
+          <w:highlight w:val="green"/>
+        </w:rPr>
+      </w:pPr>
+      <w:r>
+        <w:rPr>
+          <w:highlight w:val="green"/>
+        </w:rPr>
+        <w:t xml:space="preserve">        display: </w:t>
+      </w:r>
+      <w:proofErr w:type="spellStart"/>
+      <w:r>
+        <w:rPr>
+          <w:highlight w:val="green"/>
+        </w:rPr>
+        <w:t>none</w:t>
+      </w:r>
+      <w:proofErr w:type="spellEnd"/>
+      <w:r>
+        <w:rPr>
+          <w:highlight w:val="green"/>
+        </w:rPr>
+        <w:t>;</w:t>
+      </w:r>
+    </w:p>
+    <w:p>
+      <w:pPr>
+        <w:rPr>
+          <w:highlight w:val="green"/>
+        </w:rPr>
+      </w:pPr>
+      <w:r>
+        <w:rPr>
+          <w:highlight w:val="green"/>
+        </w:rPr>
+        <w:t xml:space="preserve">        </w:t>
+      </w:r>
+      <w:proofErr w:type="spellStart"/>
+      <w:r>
+        <w:rPr>
+          <w:highlight w:val="green"/>
+        </w:rPr>
+        <w:t>width</w:t>
+      </w:r>
+      <w:proofErr w:type="spellEnd"/>
+      <w:r>
+        <w:rPr>
+          <w:highlight w:val="green"/>
+        </w:rPr>
+        <w:t>: 100%;</w:t>
       </w:r>
     </w:p>
     <w:p>
@@ -393,15 +689,111 @@
     </w:p>
     <w:p>
       <w:r>
-        <w:t xml:space="preserve">A Css szerkesztése a reszponzív kinézethez: </w:t>
-      </w:r>
-      <w:r>
-        <w:t xml:space="preserve">Az, hogy a főmenü mobilon hamburgeres legyen, a Bootstrap reszponzív menü mintából jön, az oldal-07.html fájlban navbar, navbar-toggler, collapse navbar-collapse szerkezettel. </w:t>
-      </w:r>
-    </w:p>
-    <w:p>
-      <w:r>
-        <w:t>Az, hogy a 2. és 3. szint külön second-level-menu és third-level-menu legyen, valamint asztali nézetben position: absolute és display: none alapról induljon, a tobbszintu-menu2.html mintából jön. Ott a menük alapból rejtve vannak, és hoverre nyílnak</w:t>
+        <w:t xml:space="preserve">A </w:t>
+      </w:r>
+      <w:proofErr w:type="spellStart"/>
+      <w:r>
+        <w:t>Css</w:t>
+      </w:r>
+      <w:proofErr w:type="spellEnd"/>
+      <w:r>
+        <w:t xml:space="preserve"> szerkesztése a reszponzív kinézethez: </w:t>
+      </w:r>
+      <w:r>
+        <w:t xml:space="preserve">Az, hogy a főmenü mobilon hamburgeres legyen, a </w:t>
+      </w:r>
+      <w:proofErr w:type="spellStart"/>
+      <w:r>
+        <w:t>Bootstrap</w:t>
+      </w:r>
+      <w:proofErr w:type="spellEnd"/>
+      <w:r>
+        <w:t xml:space="preserve"> reszponzív menü mintából jön, az oldal-07.html fájlban </w:t>
+      </w:r>
+      <w:proofErr w:type="spellStart"/>
+      <w:r>
+        <w:t>navbar</w:t>
+      </w:r>
+      <w:proofErr w:type="spellEnd"/>
+      <w:r>
+        <w:t xml:space="preserve">, </w:t>
+      </w:r>
+      <w:proofErr w:type="spellStart"/>
+      <w:r>
+        <w:t>navbar-toggler</w:t>
+      </w:r>
+      <w:proofErr w:type="spellEnd"/>
+      <w:r>
+        <w:t xml:space="preserve">, </w:t>
+      </w:r>
+      <w:proofErr w:type="spellStart"/>
+      <w:r>
+        <w:t>collapse</w:t>
+      </w:r>
+      <w:proofErr w:type="spellEnd"/>
+      <w:r>
+        <w:t xml:space="preserve"> </w:t>
+      </w:r>
+      <w:proofErr w:type="spellStart"/>
+      <w:r>
+        <w:t>navbar-collapse</w:t>
+      </w:r>
+      <w:proofErr w:type="spellEnd"/>
+      <w:r>
+        <w:t xml:space="preserve"> szerkezettel. </w:t>
+      </w:r>
+    </w:p>
+    <w:p>
+      <w:r>
+        <w:t xml:space="preserve">Az, hogy a 2. és 3. szint külön </w:t>
+      </w:r>
+      <w:proofErr w:type="spellStart"/>
+      <w:r>
+        <w:t>second-level-menu</w:t>
+      </w:r>
+      <w:proofErr w:type="spellEnd"/>
+      <w:r>
+        <w:t xml:space="preserve"> és </w:t>
+      </w:r>
+      <w:proofErr w:type="spellStart"/>
+      <w:r>
+        <w:t>third-level-menu</w:t>
+      </w:r>
+      <w:proofErr w:type="spellEnd"/>
+      <w:r>
+        <w:t xml:space="preserve"> legyen, valamint asztali nézetben </w:t>
+      </w:r>
+      <w:proofErr w:type="spellStart"/>
+      <w:r>
+        <w:t>position</w:t>
+      </w:r>
+      <w:proofErr w:type="spellEnd"/>
+      <w:r>
+        <w:t xml:space="preserve">: </w:t>
+      </w:r>
+      <w:proofErr w:type="spellStart"/>
+      <w:r>
+        <w:t>absolute</w:t>
+      </w:r>
+      <w:proofErr w:type="spellEnd"/>
+      <w:r>
+        <w:t xml:space="preserve"> és display: </w:t>
+      </w:r>
+      <w:proofErr w:type="spellStart"/>
+      <w:r>
+        <w:t>none</w:t>
+      </w:r>
+      <w:proofErr w:type="spellEnd"/>
+      <w:r>
+        <w:t xml:space="preserve"> alapról induljon, a tobbszintu-menu2.html mintából jön. Ott a menük alapból rejtve vannak, és </w:t>
+      </w:r>
+      <w:proofErr w:type="spellStart"/>
+      <w:r>
+        <w:t>hoverre</w:t>
+      </w:r>
+      <w:proofErr w:type="spellEnd"/>
+      <w:r>
+        <w:t xml:space="preserve"> nyílnak</w:t>
       </w:r>
     </w:p>
     <w:p>
@@ -448,7 +840,15 @@
         </w:numPr>
       </w:pPr>
       <w:r>
-        <w:t xml:space="preserve">display: none; induló állapot az almenükre → tobbszintu-menu2.html </w:t>
+        <w:t xml:space="preserve">display: </w:t>
+      </w:r>
+      <w:proofErr w:type="spellStart"/>
+      <w:r>
+        <w:t>none</w:t>
+      </w:r>
+      <w:proofErr w:type="spellEnd"/>
+      <w:r>
+        <w:t xml:space="preserve">; induló állapot az almenükre → tobbszintu-menu2.html </w:t>
       </w:r>
     </w:p>
     <w:p>
@@ -459,7 +859,15 @@
         </w:numPr>
       </w:pPr>
       <w:r>
-        <w:t xml:space="preserve">a fő hamburger menü Bootstrap-collapsos működése → oldal-07.html </w:t>
+        <w:t xml:space="preserve">a fő hamburger menü </w:t>
+      </w:r>
+      <w:proofErr w:type="spellStart"/>
+      <w:r>
+        <w:t>Bootstrap-collapsos</w:t>
+      </w:r>
+      <w:proofErr w:type="spellEnd"/>
+      <w:r>
+        <w:t xml:space="preserve"> működése → oldal-07.html </w:t>
       </w:r>
     </w:p>
     <w:p>
@@ -484,8 +892,21 @@
           <w:numId w:val="2"/>
         </w:numPr>
       </w:pPr>
-      <w:r>
-        <w:t xml:space="preserve">position: static; </w:t>
+      <w:proofErr w:type="spellStart"/>
+      <w:r>
+        <w:t>position</w:t>
+      </w:r>
+      <w:proofErr w:type="spellEnd"/>
+      <w:r>
+        <w:t xml:space="preserve">: </w:t>
+      </w:r>
+      <w:proofErr w:type="spellStart"/>
+      <w:r>
+        <w:t>static</w:t>
+      </w:r>
+      <w:proofErr w:type="spellEnd"/>
+      <w:r>
+        <w:t xml:space="preserve">; </w:t>
       </w:r>
     </w:p>
     <w:p>
@@ -495,8 +916,13 @@
           <w:numId w:val="2"/>
         </w:numPr>
       </w:pPr>
-      <w:r>
-        <w:t xml:space="preserve">width: 100%; </w:t>
+      <w:proofErr w:type="spellStart"/>
+      <w:r>
+        <w:t>width</w:t>
+      </w:r>
+      <w:proofErr w:type="spellEnd"/>
+      <w:r>
+        <w:t xml:space="preserve">: 100%; </w:t>
       </w:r>
     </w:p>
     <w:p>
@@ -507,7 +933,15 @@
         </w:numPr>
       </w:pPr>
       <w:r>
-        <w:t xml:space="preserve">margin-left: 20px; </w:t>
+        <w:t>margin-</w:t>
+      </w:r>
+      <w:proofErr w:type="spellStart"/>
+      <w:r>
+        <w:t>left</w:t>
+      </w:r>
+      <w:proofErr w:type="spellEnd"/>
+      <w:r>
+        <w:t xml:space="preserve">: 20px; </w:t>
       </w:r>
     </w:p>
     <w:p>
@@ -521,8 +955,13 @@
           <w:noProof/>
         </w:rPr>
       </w:pPr>
-      <w:r>
-        <w:t>Grid megvalósítása úgy hogy 2 oszlop legyen:</w:t>
+      <w:proofErr w:type="spellStart"/>
+      <w:r>
+        <w:t>Grid</w:t>
+      </w:r>
+      <w:proofErr w:type="spellEnd"/>
+      <w:r>
+        <w:t xml:space="preserve"> megvalósítása úgy hogy 2 oszlop legyen:</w:t>
       </w:r>
       <w:r>
         <w:rPr>
@@ -622,13 +1061,58 @@
       </w:r>
     </w:p>
     <w:p>
-      <w:r>
-        <w:t>Navbar-brand újragondolása, így azt írja ki ami az oldal fejléc címe:</w:t>
-      </w:r>
-    </w:p>
-    <w:p>
-      <w:r>
-        <w:t> &lt;a class="navbar-brand" href="."&gt;&lt;?= $fejlec['cim'] ?&gt;&lt;/a&gt;</w:t>
+      <w:proofErr w:type="spellStart"/>
+      <w:r>
+        <w:t>Navbar-brand</w:t>
+      </w:r>
+      <w:proofErr w:type="spellEnd"/>
+      <w:r>
+        <w:t xml:space="preserve"> újragondolása, így azt írja ki ami az oldal fejléc címe:</w:t>
+      </w:r>
+    </w:p>
+    <w:p>
+      <w:r>
+        <w:t xml:space="preserve"> &lt;a </w:t>
+      </w:r>
+      <w:proofErr w:type="spellStart"/>
+      <w:r>
+        <w:t>class</w:t>
+      </w:r>
+      <w:proofErr w:type="spellEnd"/>
+      <w:r>
+        <w:t>="</w:t>
+      </w:r>
+      <w:proofErr w:type="spellStart"/>
+      <w:r>
+        <w:t>navbar-brand</w:t>
+      </w:r>
+      <w:proofErr w:type="spellEnd"/>
+      <w:r>
+        <w:t xml:space="preserve">" </w:t>
+      </w:r>
+      <w:proofErr w:type="spellStart"/>
+      <w:r>
+        <w:t>href</w:t>
+      </w:r>
+      <w:proofErr w:type="spellEnd"/>
+      <w:r>
+        <w:t>="."&gt;&lt;?= $</w:t>
+      </w:r>
+      <w:proofErr w:type="spellStart"/>
+      <w:r>
+        <w:t>fejlec</w:t>
+      </w:r>
+      <w:proofErr w:type="spellEnd"/>
+      <w:r>
+        <w:t>['</w:t>
+      </w:r>
+      <w:proofErr w:type="spellStart"/>
+      <w:r>
+        <w:t>cim</w:t>
+      </w:r>
+      <w:proofErr w:type="spellEnd"/>
+      <w:r>
+        <w:t>'] ?&gt;&lt;/a&gt;</w:t>
       </w:r>
     </w:p>
     <w:p>
@@ -668,6 +1152,274 @@
             </a:graphic>
           </wp:inline>
         </w:drawing>
+      </w:r>
+    </w:p>
+    <w:p/>
+    <w:p>
+      <w:r>
+        <w:lastRenderedPageBreak/>
+        <w:t>HTML5 szemantikus elemek javítása</w:t>
+      </w:r>
+      <w:r>
+        <w:t>:</w:t>
+      </w:r>
+    </w:p>
+    <w:p>
+      <w:r>
+        <w:t>A HTML5 szemantikus elemek használata érdekében a tartalmi részeket &lt;</w:t>
+      </w:r>
+      <w:proofErr w:type="spellStart"/>
+      <w:r>
+        <w:t>section</w:t>
+      </w:r>
+      <w:proofErr w:type="spellEnd"/>
+      <w:r>
+        <w:t>&gt; elemekkel tagoltuk, amely segíti a strukturált felépítést.</w:t>
+      </w:r>
+    </w:p>
+    <w:p>
+      <w:r>
+        <w:t>Azaz</w:t>
+      </w:r>
+    </w:p>
+    <w:p>
+      <w:r>
+        <w:t>Sima:</w:t>
+      </w:r>
+      <w:r>
+        <w:t>&lt;h2&gt;Köszöntés&lt;/h2&gt;</w:t>
+      </w:r>
+      <w:r>
+        <w:t xml:space="preserve"> helyett ez lett:</w:t>
+      </w:r>
+    </w:p>
+    <w:p>
+      <w:r>
+        <w:t>&lt;</w:t>
+      </w:r>
+      <w:proofErr w:type="spellStart"/>
+      <w:r>
+        <w:t>section</w:t>
+      </w:r>
+      <w:proofErr w:type="spellEnd"/>
+      <w:r>
+        <w:t>&gt;</w:t>
+      </w:r>
+      <w:r>
+        <w:br/>
+        <w:t>&lt;h2&gt;Köszöntés&lt;/h2&gt;</w:t>
+      </w:r>
+      <w:r>
+        <w:br/>
+        <w:t>&lt;/</w:t>
+      </w:r>
+      <w:proofErr w:type="spellStart"/>
+      <w:r>
+        <w:t>section</w:t>
+      </w:r>
+      <w:proofErr w:type="spellEnd"/>
+      <w:r>
+        <w:t>&gt;</w:t>
+      </w:r>
+    </w:p>
+    <w:p>
+      <w:r>
+        <w:t xml:space="preserve">Plusz </w:t>
+      </w:r>
+      <w:proofErr w:type="spellStart"/>
+      <w:r>
+        <w:t>Div</w:t>
+      </w:r>
+      <w:proofErr w:type="spellEnd"/>
+      <w:r>
+        <w:t xml:space="preserve"> doboz helyett átalakítottuk a </w:t>
+      </w:r>
+      <w:proofErr w:type="spellStart"/>
+      <w:r>
+        <w:t>maint</w:t>
+      </w:r>
+      <w:proofErr w:type="spellEnd"/>
+      <w:r>
+        <w:t xml:space="preserve"> erről:</w:t>
+      </w:r>
+    </w:p>
+    <w:p>
+      <w:pPr>
+        <w:ind w:left="708"/>
+      </w:pPr>
+      <w:r>
+        <w:t xml:space="preserve">&lt;main </w:t>
+      </w:r>
+      <w:proofErr w:type="spellStart"/>
+      <w:r>
+        <w:t>id</w:t>
+      </w:r>
+      <w:proofErr w:type="spellEnd"/>
+      <w:r>
+        <w:t>="</w:t>
+      </w:r>
+      <w:proofErr w:type="spellStart"/>
+      <w:r>
+        <w:t>wrapper</w:t>
+      </w:r>
+      <w:proofErr w:type="spellEnd"/>
+      <w:r>
+        <w:t xml:space="preserve">"&gt; </w:t>
+      </w:r>
+      <w:r>
+        <w:br/>
+        <w:t xml:space="preserve">&lt;div </w:t>
+      </w:r>
+      <w:proofErr w:type="spellStart"/>
+      <w:r>
+        <w:t>id</w:t>
+      </w:r>
+      <w:proofErr w:type="spellEnd"/>
+      <w:r>
+        <w:t>="</w:t>
+      </w:r>
+      <w:proofErr w:type="spellStart"/>
+      <w:r>
+        <w:t>content</w:t>
+      </w:r>
+      <w:proofErr w:type="spellEnd"/>
+      <w:r>
+        <w:t>"&gt;</w:t>
+      </w:r>
+      <w:r>
+        <w:br/>
+      </w:r>
+      <w:r>
+        <w:t xml:space="preserve">&lt;?php </w:t>
+      </w:r>
+      <w:proofErr w:type="spellStart"/>
+      <w:r>
+        <w:t>include</w:t>
+      </w:r>
+      <w:proofErr w:type="spellEnd"/>
+      <w:r>
+        <w:t>("./</w:t>
+      </w:r>
+      <w:proofErr w:type="spellStart"/>
+      <w:r>
+        <w:t>templates</w:t>
+      </w:r>
+      <w:proofErr w:type="spellEnd"/>
+      <w:r>
+        <w:t>/</w:t>
+      </w:r>
+      <w:proofErr w:type="spellStart"/>
+      <w:r>
+        <w:t>pages</w:t>
+      </w:r>
+      <w:proofErr w:type="spellEnd"/>
+      <w:r>
+        <w:t>/{$keres['</w:t>
+      </w:r>
+      <w:proofErr w:type="spellStart"/>
+      <w:r>
+        <w:t>fajl</w:t>
+      </w:r>
+      <w:proofErr w:type="spellEnd"/>
+      <w:r>
+        <w:t>']}.</w:t>
+      </w:r>
+      <w:proofErr w:type="spellStart"/>
+      <w:r>
+        <w:t>tpl.php</w:t>
+      </w:r>
+      <w:proofErr w:type="spellEnd"/>
+      <w:r>
+        <w:t>"); ?&gt;</w:t>
+      </w:r>
+      <w:r>
+        <w:br/>
+        <w:t>&lt;/main&gt;</w:t>
+      </w:r>
+    </w:p>
+    <w:p>
+      <w:r>
+        <w:t>Erre:</w:t>
+      </w:r>
+    </w:p>
+    <w:p>
+      <w:r>
+        <w:t xml:space="preserve"> &lt;main </w:t>
+      </w:r>
+      <w:proofErr w:type="spellStart"/>
+      <w:r>
+        <w:t>id</w:t>
+      </w:r>
+      <w:proofErr w:type="spellEnd"/>
+      <w:r>
+        <w:t>="</w:t>
+      </w:r>
+      <w:proofErr w:type="spellStart"/>
+      <w:r>
+        <w:t>content</w:t>
+      </w:r>
+      <w:proofErr w:type="spellEnd"/>
+      <w:r>
+        <w:t>"&gt;</w:t>
+      </w:r>
+    </w:p>
+    <w:p>
+      <w:r>
+        <w:t xml:space="preserve">            &lt;?php </w:t>
+      </w:r>
+      <w:proofErr w:type="spellStart"/>
+      <w:r>
+        <w:t>include</w:t>
+      </w:r>
+      <w:proofErr w:type="spellEnd"/>
+      <w:r>
+        <w:t>("./</w:t>
+      </w:r>
+      <w:proofErr w:type="spellStart"/>
+      <w:r>
+        <w:t>templates</w:t>
+      </w:r>
+      <w:proofErr w:type="spellEnd"/>
+      <w:r>
+        <w:t>/</w:t>
+      </w:r>
+      <w:proofErr w:type="spellStart"/>
+      <w:r>
+        <w:t>pages</w:t>
+      </w:r>
+      <w:proofErr w:type="spellEnd"/>
+      <w:r>
+        <w:t>/{$keres['</w:t>
+      </w:r>
+      <w:proofErr w:type="spellStart"/>
+      <w:r>
+        <w:t>fajl</w:t>
+      </w:r>
+      <w:proofErr w:type="spellEnd"/>
+      <w:r>
+        <w:t>']}.</w:t>
+      </w:r>
+      <w:proofErr w:type="spellStart"/>
+      <w:r>
+        <w:t>tpl.php</w:t>
+      </w:r>
+      <w:proofErr w:type="spellEnd"/>
+      <w:r>
+        <w:t>"); ?&gt;</w:t>
+      </w:r>
+    </w:p>
+    <w:p>
+      <w:r>
+        <w:t>        &lt;/main&gt;</w:t>
+      </w:r>
+      <w:r>
+        <w:t xml:space="preserve"> -</w:t>
+      </w:r>
+      <w:r>
+        <w:sym w:font="Wingdings" w:char="F0E0"/>
+      </w:r>
+      <w:r>
+        <w:t xml:space="preserve"> div doboz helyett</w:t>
       </w:r>
       <w:r>
         <w:br/>

</xml_diff>

<commit_message>
felesleges "}" törlése az üzenetek menüpontból
</commit_message>
<xml_diff>
--- a/Dokumentáció.docx
+++ b/Dokumentáció.docx
@@ -5515,15 +5515,7 @@
       </w:r>
       <w:proofErr w:type="spellEnd"/>
       <w:r>
-        <w:t xml:space="preserve"> '</w:t>
-      </w:r>
-      <w:proofErr w:type="gramStart"/>
-      <w:r>
-        <w:t>..</w:t>
-      </w:r>
-      <w:proofErr w:type="gramEnd"/>
-      <w:r>
-        <w:t>/</w:t>
+        <w:t xml:space="preserve"> '../</w:t>
       </w:r>
       <w:proofErr w:type="spellStart"/>
       <w:r>
@@ -8211,15 +8203,7 @@
       </w:r>
       <w:proofErr w:type="spellEnd"/>
       <w:r>
-        <w:t xml:space="preserve"> '</w:t>
-      </w:r>
-      <w:proofErr w:type="gramStart"/>
-      <w:r>
-        <w:t>..</w:t>
-      </w:r>
-      <w:proofErr w:type="gramEnd"/>
-      <w:r>
-        <w:t>/</w:t>
+        <w:t xml:space="preserve"> '../</w:t>
       </w:r>
       <w:proofErr w:type="spellStart"/>
       <w:r>
@@ -9397,15 +9381,19 @@
     </w:p>
     <w:p>
       <w:r>
-        <w:t xml:space="preserve">Mikor ezzel kész lettünk, lemódosítottuk, hogy a dátum mezőt is dátum </w:t>
-      </w:r>
-      <w:proofErr w:type="spellStart"/>
-      <w:r>
-        <w:t>formtumbn</w:t>
-      </w:r>
-      <w:proofErr w:type="spellEnd"/>
-      <w:r>
-        <w:t xml:space="preserve"> lehessen megadni:</w:t>
+        <w:t>Mikor ezzel kész lettünk, lemódosítottuk, hogy a dátum mezőt is dátum form</w:t>
+      </w:r>
+      <w:r>
+        <w:t>á</w:t>
+      </w:r>
+      <w:r>
+        <w:t>tumb</w:t>
+      </w:r>
+      <w:r>
+        <w:t>a</w:t>
+      </w:r>
+      <w:r>
+        <w:t>n lehessen megadni:</w:t>
       </w:r>
     </w:p>
     <w:p>
@@ -9417,6 +9405,8 @@
       <w:r>
         <w:t xml:space="preserve"> oldalon csere:</w:t>
       </w:r>
+      <w:bookmarkStart w:id="0" w:name="_GoBack"/>
+      <w:bookmarkEnd w:id="0"/>
     </w:p>
     <w:p>
       <w:pPr>
@@ -10302,8 +10292,6 @@
       <w:r>
         <w:t xml:space="preserve"> A tartalom résznek egy 2 oszlopos elrendezést alakítottunk ki, ami egymás alá rendeződik, ha éppen keskenyebb kijelzőn tekintik meg az oldalt.</w:t>
       </w:r>
-      <w:bookmarkStart w:id="0" w:name="_GoBack"/>
-      <w:bookmarkEnd w:id="0"/>
       <w:r>
         <w:t xml:space="preserve"> </w:t>
       </w:r>
@@ -10335,7 +10323,520 @@
         <w:t xml:space="preserve"> segítségével szintén sikerült beágyazni a magyar forma-1-es versenyek helyszínét. Illetve ennél a résznél pontosítottuk a menüpontok nevét, sorrendjét, és a követelményeknek megfelelően csak azokat hagytuk benne, amik szükségesek.</w:t>
       </w:r>
     </w:p>
-    <w:p/>
+    <w:p>
+      <w:r>
+        <w:t>Kapcsolat:</w:t>
+      </w:r>
+    </w:p>
+    <w:p>
+      <w:pPr>
+        <w:shd w:val="clear" w:color="auto" w:fill="FFFFFF"/>
+        <w:spacing w:line="285" w:lineRule="atLeast"/>
+        <w:rPr>
+          <w:rFonts w:eastAsia="Times New Roman" w:cstheme="minorHAnsi"/>
+          <w:color w:val="000000"/>
+          <w:sz w:val="21"/>
+          <w:szCs w:val="21"/>
+          <w:lang w:eastAsia="hu-HU"/>
+        </w:rPr>
+      </w:pPr>
+      <w:r>
+        <w:t xml:space="preserve">Létrehoztuk magát a menüt, mely </w:t>
+      </w:r>
+      <w:proofErr w:type="spellStart"/>
+      <w:r>
+        <w:t>tartamaz</w:t>
+      </w:r>
+      <w:proofErr w:type="spellEnd"/>
+      <w:r>
+        <w:t xml:space="preserve"> 2 gombot (Küld, Ellenőriz), és 2 beírási lehetőséget. A menüt CSS segítségével egy kicsit megformáztuk (kapott egy keretet lekerekített szélekkel, és margókkal) Az órai agyagban lévő ellenőrző kódokból indultunk ki. A </w:t>
+      </w:r>
+      <w:proofErr w:type="spellStart"/>
+      <w:r>
+        <w:t>javascript</w:t>
+      </w:r>
+      <w:proofErr w:type="spellEnd"/>
+      <w:r>
+        <w:t xml:space="preserve"> kódból lényegében teljes egészében ki lehetett indulni, csak a felesleges részeket kellett belőle kitörölni (ez a fájl lett az „</w:t>
+      </w:r>
+      <w:proofErr w:type="spellStart"/>
+      <w:r>
+        <w:t>ellenorzes.js</w:t>
+      </w:r>
+      <w:proofErr w:type="spellEnd"/>
+      <w:r>
+        <w:t>” a „</w:t>
+      </w:r>
+      <w:proofErr w:type="spellStart"/>
+      <w:r>
+        <w:t>logicals</w:t>
+      </w:r>
+      <w:proofErr w:type="spellEnd"/>
+      <w:r>
+        <w:t>” mappán belül). A szerveroldali ellenőrzésnél is nagyon hasonló volt a helyzet, azzal a különbséggel, hogy a „</w:t>
+      </w:r>
+      <w:r>
+        <w:rPr>
+          <w:rFonts w:ascii="Consolas" w:eastAsia="Times New Roman" w:hAnsi="Consolas" w:cs="Times New Roman"/>
+          <w:color w:val="795E26"/>
+          <w:sz w:val="21"/>
+          <w:szCs w:val="21"/>
+          <w:lang w:eastAsia="hu-HU"/>
+        </w:rPr>
+        <w:t>session_</w:t>
+      </w:r>
+      <w:proofErr w:type="gramStart"/>
+      <w:r>
+        <w:rPr>
+          <w:rFonts w:ascii="Consolas" w:eastAsia="Times New Roman" w:hAnsi="Consolas" w:cs="Times New Roman"/>
+          <w:color w:val="795E26"/>
+          <w:sz w:val="21"/>
+          <w:szCs w:val="21"/>
+          <w:lang w:eastAsia="hu-HU"/>
+        </w:rPr>
+        <w:t>start</w:t>
+      </w:r>
+      <w:r>
+        <w:rPr>
+          <w:rFonts w:ascii="Consolas" w:eastAsia="Times New Roman" w:hAnsi="Consolas" w:cs="Times New Roman"/>
+          <w:color w:val="000000"/>
+          <w:sz w:val="21"/>
+          <w:szCs w:val="21"/>
+          <w:lang w:eastAsia="hu-HU"/>
+        </w:rPr>
+        <w:t>(</w:t>
+      </w:r>
+      <w:proofErr w:type="gramEnd"/>
+      <w:r>
+        <w:rPr>
+          <w:rFonts w:ascii="Consolas" w:eastAsia="Times New Roman" w:hAnsi="Consolas" w:cs="Times New Roman"/>
+          <w:color w:val="000000"/>
+          <w:sz w:val="21"/>
+          <w:szCs w:val="21"/>
+          <w:lang w:eastAsia="hu-HU"/>
+        </w:rPr>
+        <w:t>);</w:t>
+      </w:r>
+      <w:r>
+        <w:rPr>
+          <w:rFonts w:ascii="Consolas" w:eastAsia="Times New Roman" w:hAnsi="Consolas" w:cs="Times New Roman"/>
+          <w:color w:val="000000"/>
+          <w:sz w:val="21"/>
+          <w:szCs w:val="21"/>
+          <w:lang w:eastAsia="hu-HU"/>
+        </w:rPr>
+        <w:t xml:space="preserve">” </w:t>
+      </w:r>
+      <w:r>
+        <w:rPr>
+          <w:rFonts w:eastAsia="Times New Roman" w:cstheme="minorHAnsi"/>
+          <w:color w:val="000000"/>
+          <w:sz w:val="21"/>
+          <w:szCs w:val="21"/>
+          <w:lang w:eastAsia="hu-HU"/>
+        </w:rPr>
+        <w:t xml:space="preserve">parancs nem akart működni először, és ezt beletettük egy olyan függvénybe, ami </w:t>
+      </w:r>
+      <w:r>
+        <w:rPr>
+          <w:rFonts w:eastAsia="Times New Roman" w:cstheme="minorHAnsi"/>
+          <w:color w:val="000000"/>
+          <w:sz w:val="21"/>
+          <w:szCs w:val="21"/>
+          <w:lang w:eastAsia="hu-HU"/>
+        </w:rPr>
+        <w:t xml:space="preserve">először </w:t>
+      </w:r>
+      <w:r>
+        <w:rPr>
+          <w:rFonts w:eastAsia="Times New Roman" w:cstheme="minorHAnsi"/>
+          <w:color w:val="000000"/>
+          <w:sz w:val="21"/>
+          <w:szCs w:val="21"/>
+          <w:lang w:eastAsia="hu-HU"/>
+        </w:rPr>
+        <w:t>ellenőrzi a státuszát.</w:t>
+      </w:r>
+    </w:p>
+    <w:p>
+      <w:pPr>
+        <w:shd w:val="clear" w:color="auto" w:fill="FFFFFF"/>
+        <w:spacing w:line="285" w:lineRule="atLeast"/>
+        <w:rPr>
+          <w:rFonts w:ascii="Consolas" w:eastAsia="Times New Roman" w:hAnsi="Consolas" w:cs="Times New Roman"/>
+          <w:color w:val="202020"/>
+          <w:sz w:val="21"/>
+          <w:szCs w:val="21"/>
+          <w:lang w:eastAsia="hu-HU"/>
+        </w:rPr>
+      </w:pPr>
+      <w:r>
+        <w:rPr>
+          <w:rFonts w:ascii="Consolas" w:eastAsia="Times New Roman" w:hAnsi="Consolas" w:cs="Times New Roman"/>
+          <w:color w:val="202020"/>
+          <w:sz w:val="21"/>
+          <w:szCs w:val="21"/>
+          <w:lang w:eastAsia="hu-HU"/>
+        </w:rPr>
+        <w:drawing>
+          <wp:inline distT="0" distB="0" distL="0" distR="0" wp14:anchorId="7790E99B" wp14:editId="4A5F085C">
+            <wp:extent cx="5760720" cy="2722880"/>
+            <wp:effectExtent l="0" t="0" r="0" b="1270"/>
+            <wp:docPr id="2" name="Kép 2"/>
+            <wp:cNvGraphicFramePr>
+              <a:graphicFrameLocks xmlns:a="http://schemas.openxmlformats.org/drawingml/2006/main" noChangeAspect="1"/>
+            </wp:cNvGraphicFramePr>
+            <a:graphic xmlns:a="http://schemas.openxmlformats.org/drawingml/2006/main">
+              <a:graphicData uri="http://schemas.openxmlformats.org/drawingml/2006/picture">
+                <pic:pic xmlns:pic="http://schemas.openxmlformats.org/drawingml/2006/picture">
+                  <pic:nvPicPr>
+                    <pic:cNvPr id="1" name=""/>
+                    <pic:cNvPicPr/>
+                  </pic:nvPicPr>
+                  <pic:blipFill>
+                    <a:blip r:embed="rId22"/>
+                    <a:stretch>
+                      <a:fillRect/>
+                    </a:stretch>
+                  </pic:blipFill>
+                  <pic:spPr>
+                    <a:xfrm>
+                      <a:off x="0" y="0"/>
+                      <a:ext cx="5760720" cy="2722880"/>
+                    </a:xfrm>
+                    <a:prstGeom prst="rect">
+                      <a:avLst/>
+                    </a:prstGeom>
+                  </pic:spPr>
+                </pic:pic>
+              </a:graphicData>
+            </a:graphic>
+          </wp:inline>
+        </w:drawing>
+      </w:r>
+    </w:p>
+    <w:p>
+      <w:pPr>
+        <w:shd w:val="clear" w:color="auto" w:fill="FFFFFF"/>
+        <w:spacing w:line="285" w:lineRule="atLeast"/>
+        <w:rPr>
+          <w:rFonts w:eastAsia="Times New Roman" w:cstheme="minorHAnsi"/>
+          <w:color w:val="202020"/>
+          <w:sz w:val="21"/>
+          <w:szCs w:val="21"/>
+          <w:lang w:eastAsia="hu-HU"/>
+        </w:rPr>
+      </w:pPr>
+      <w:r>
+        <w:rPr>
+          <w:rFonts w:eastAsia="Times New Roman" w:cstheme="minorHAnsi"/>
+          <w:color w:val="202020"/>
+          <w:sz w:val="21"/>
+          <w:szCs w:val="21"/>
+          <w:lang w:eastAsia="hu-HU"/>
+        </w:rPr>
+        <w:lastRenderedPageBreak/>
+        <w:t>Üzenetek:</w:t>
+      </w:r>
+    </w:p>
+    <w:p>
+      <w:pPr>
+        <w:shd w:val="clear" w:color="auto" w:fill="FFFFFF"/>
+        <w:spacing w:line="285" w:lineRule="atLeast"/>
+        <w:rPr>
+          <w:rFonts w:ascii="Consolas" w:eastAsia="Times New Roman" w:hAnsi="Consolas" w:cs="Times New Roman"/>
+          <w:color w:val="000000"/>
+          <w:sz w:val="21"/>
+          <w:szCs w:val="21"/>
+          <w:lang w:eastAsia="hu-HU"/>
+        </w:rPr>
+      </w:pPr>
+      <w:r>
+        <w:rPr>
+          <w:rFonts w:eastAsia="Times New Roman" w:cstheme="minorHAnsi"/>
+          <w:color w:val="202020"/>
+          <w:sz w:val="21"/>
+          <w:szCs w:val="21"/>
+          <w:lang w:eastAsia="hu-HU"/>
+        </w:rPr>
+        <w:t xml:space="preserve">A </w:t>
+      </w:r>
+      <w:proofErr w:type="spellStart"/>
+      <w:r>
+        <w:rPr>
+          <w:rFonts w:eastAsia="Times New Roman" w:cstheme="minorHAnsi"/>
+          <w:color w:val="202020"/>
+          <w:sz w:val="21"/>
+          <w:szCs w:val="21"/>
+          <w:lang w:eastAsia="hu-HU"/>
+        </w:rPr>
+        <w:t>config.inc.php</w:t>
+      </w:r>
+      <w:proofErr w:type="spellEnd"/>
+      <w:r>
+        <w:rPr>
+          <w:rFonts w:eastAsia="Times New Roman" w:cstheme="minorHAnsi"/>
+          <w:color w:val="202020"/>
+          <w:sz w:val="21"/>
+          <w:szCs w:val="21"/>
+          <w:lang w:eastAsia="hu-HU"/>
+        </w:rPr>
+        <w:t xml:space="preserve"> fájlban létrehoztunk egy új menüpontot. </w:t>
+      </w:r>
+      <w:r>
+        <w:rPr>
+          <w:rFonts w:eastAsia="Times New Roman" w:cstheme="minorHAnsi"/>
+          <w:color w:val="202020"/>
+          <w:sz w:val="21"/>
+          <w:szCs w:val="21"/>
+          <w:lang w:eastAsia="hu-HU"/>
+        </w:rPr>
+        <w:t xml:space="preserve"> A beállításai: </w:t>
+      </w:r>
+      <w:r>
+        <w:rPr>
+          <w:rFonts w:ascii="Consolas" w:eastAsia="Times New Roman" w:hAnsi="Consolas" w:cs="Times New Roman"/>
+          <w:color w:val="0A3069"/>
+          <w:sz w:val="21"/>
+          <w:szCs w:val="21"/>
+          <w:lang w:eastAsia="hu-HU"/>
+        </w:rPr>
+        <w:t>'</w:t>
+      </w:r>
+      <w:proofErr w:type="spellStart"/>
+      <w:r>
+        <w:rPr>
+          <w:rFonts w:ascii="Consolas" w:eastAsia="Times New Roman" w:hAnsi="Consolas" w:cs="Times New Roman"/>
+          <w:color w:val="0A3069"/>
+          <w:sz w:val="21"/>
+          <w:szCs w:val="21"/>
+          <w:lang w:eastAsia="hu-HU"/>
+        </w:rPr>
+        <w:t>menun</w:t>
+      </w:r>
+      <w:proofErr w:type="spellEnd"/>
+      <w:r>
+        <w:rPr>
+          <w:rFonts w:ascii="Consolas" w:eastAsia="Times New Roman" w:hAnsi="Consolas" w:cs="Times New Roman"/>
+          <w:color w:val="0A3069"/>
+          <w:sz w:val="21"/>
+          <w:szCs w:val="21"/>
+          <w:lang w:eastAsia="hu-HU"/>
+        </w:rPr>
+        <w:t>'</w:t>
+      </w:r>
+      <w:r>
+        <w:rPr>
+          <w:rFonts w:ascii="Consolas" w:eastAsia="Times New Roman" w:hAnsi="Consolas" w:cs="Times New Roman"/>
+          <w:color w:val="000000"/>
+          <w:sz w:val="21"/>
+          <w:szCs w:val="21"/>
+          <w:lang w:eastAsia="hu-HU"/>
+        </w:rPr>
+        <w:t xml:space="preserve"> =&gt; </w:t>
+      </w:r>
+      <w:proofErr w:type="spellStart"/>
+      <w:proofErr w:type="gramStart"/>
+      <w:r>
+        <w:rPr>
+          <w:rFonts w:ascii="Consolas" w:eastAsia="Times New Roman" w:hAnsi="Consolas" w:cs="Times New Roman"/>
+          <w:color w:val="795E26"/>
+          <w:sz w:val="21"/>
+          <w:szCs w:val="21"/>
+          <w:lang w:eastAsia="hu-HU"/>
+        </w:rPr>
+        <w:t>array</w:t>
+      </w:r>
+      <w:proofErr w:type="spellEnd"/>
+      <w:r>
+        <w:rPr>
+          <w:rFonts w:ascii="Consolas" w:eastAsia="Times New Roman" w:hAnsi="Consolas" w:cs="Times New Roman"/>
+          <w:color w:val="000000"/>
+          <w:sz w:val="21"/>
+          <w:szCs w:val="21"/>
+          <w:lang w:eastAsia="hu-HU"/>
+        </w:rPr>
+        <w:t>(</w:t>
+      </w:r>
+      <w:proofErr w:type="gramEnd"/>
+      <w:r>
+        <w:rPr>
+          <w:rFonts w:ascii="Consolas" w:eastAsia="Times New Roman" w:hAnsi="Consolas" w:cs="Times New Roman"/>
+          <w:color w:val="098658"/>
+          <w:sz w:val="21"/>
+          <w:szCs w:val="21"/>
+          <w:lang w:eastAsia="hu-HU"/>
+        </w:rPr>
+        <w:t>0</w:t>
+      </w:r>
+      <w:r>
+        <w:rPr>
+          <w:rFonts w:ascii="Consolas" w:eastAsia="Times New Roman" w:hAnsi="Consolas" w:cs="Times New Roman"/>
+          <w:color w:val="000000"/>
+          <w:sz w:val="21"/>
+          <w:szCs w:val="21"/>
+          <w:lang w:eastAsia="hu-HU"/>
+        </w:rPr>
+        <w:t xml:space="preserve">, </w:t>
+      </w:r>
+      <w:r>
+        <w:rPr>
+          <w:rFonts w:ascii="Consolas" w:eastAsia="Times New Roman" w:hAnsi="Consolas" w:cs="Times New Roman"/>
+          <w:color w:val="098658"/>
+          <w:sz w:val="21"/>
+          <w:szCs w:val="21"/>
+          <w:lang w:eastAsia="hu-HU"/>
+        </w:rPr>
+        <w:t>1</w:t>
+      </w:r>
+      <w:r>
+        <w:rPr>
+          <w:rFonts w:ascii="Consolas" w:eastAsia="Times New Roman" w:hAnsi="Consolas" w:cs="Times New Roman"/>
+          <w:color w:val="000000"/>
+          <w:sz w:val="21"/>
+          <w:szCs w:val="21"/>
+          <w:lang w:eastAsia="hu-HU"/>
+        </w:rPr>
+        <w:t>)</w:t>
+      </w:r>
+    </w:p>
+    <w:p>
+      <w:pPr>
+        <w:shd w:val="clear" w:color="auto" w:fill="FFFFFF"/>
+        <w:spacing w:line="285" w:lineRule="atLeast"/>
+        <w:rPr>
+          <w:rFonts w:eastAsia="Times New Roman" w:cstheme="minorHAnsi"/>
+          <w:color w:val="000000"/>
+          <w:sz w:val="21"/>
+          <w:szCs w:val="21"/>
+          <w:lang w:eastAsia="hu-HU"/>
+        </w:rPr>
+      </w:pPr>
+      <w:proofErr w:type="gramStart"/>
+      <w:r>
+        <w:rPr>
+          <w:rFonts w:eastAsia="Times New Roman" w:cstheme="minorHAnsi"/>
+          <w:color w:val="000000"/>
+          <w:sz w:val="21"/>
+          <w:szCs w:val="21"/>
+          <w:lang w:eastAsia="hu-HU"/>
+        </w:rPr>
+        <w:t>mivel</w:t>
+      </w:r>
+      <w:proofErr w:type="gramEnd"/>
+      <w:r>
+        <w:rPr>
+          <w:rFonts w:eastAsia="Times New Roman" w:cstheme="minorHAnsi"/>
+          <w:color w:val="000000"/>
+          <w:sz w:val="21"/>
+          <w:szCs w:val="21"/>
+          <w:lang w:eastAsia="hu-HU"/>
+        </w:rPr>
+        <w:t xml:space="preserve"> azt akartuk elérni, hogy csak a bejelentkezett felhasználók láthassák. A menüpontban egy egyszerű táblázatos elrendezés mellett döntöttünk, mivel úgy gondoltuk, hogy így jól átlátható a tartalom, és elegáns, de egyszerű megoldás.</w:t>
+      </w:r>
+      <w:r>
+        <w:rPr>
+          <w:rFonts w:eastAsia="Times New Roman" w:cstheme="minorHAnsi"/>
+          <w:color w:val="000000"/>
+          <w:sz w:val="21"/>
+          <w:szCs w:val="21"/>
+          <w:lang w:eastAsia="hu-HU"/>
+        </w:rPr>
+        <w:t xml:space="preserve"> A kód az adatbázisban eltárolt elemeket olvassa ki, és írja ki az oldalra. </w:t>
+      </w:r>
+      <w:proofErr w:type="gramStart"/>
+      <w:r>
+        <w:rPr>
+          <w:rFonts w:eastAsia="Times New Roman" w:cstheme="minorHAnsi"/>
+          <w:color w:val="000000"/>
+          <w:sz w:val="21"/>
+          <w:szCs w:val="21"/>
+          <w:lang w:eastAsia="hu-HU"/>
+        </w:rPr>
+        <w:t>Íme</w:t>
+      </w:r>
+      <w:proofErr w:type="gramEnd"/>
+      <w:r>
+        <w:rPr>
+          <w:rFonts w:eastAsia="Times New Roman" w:cstheme="minorHAnsi"/>
+          <w:color w:val="000000"/>
+          <w:sz w:val="21"/>
+          <w:szCs w:val="21"/>
+          <w:lang w:eastAsia="hu-HU"/>
+        </w:rPr>
+        <w:t xml:space="preserve"> néhány tesztüzenet:</w:t>
+      </w:r>
+    </w:p>
+    <w:p>
+      <w:pPr>
+        <w:shd w:val="clear" w:color="auto" w:fill="FFFFFF"/>
+        <w:spacing w:line="285" w:lineRule="atLeast"/>
+        <w:rPr>
+          <w:rFonts w:eastAsia="Times New Roman" w:cstheme="minorHAnsi"/>
+          <w:color w:val="000000"/>
+          <w:sz w:val="21"/>
+          <w:szCs w:val="21"/>
+          <w:lang w:eastAsia="hu-HU"/>
+        </w:rPr>
+      </w:pPr>
+      <w:r>
+        <w:rPr>
+          <w:rFonts w:eastAsia="Times New Roman" w:cstheme="minorHAnsi"/>
+          <w:color w:val="000000"/>
+          <w:sz w:val="21"/>
+          <w:szCs w:val="21"/>
+          <w:lang w:eastAsia="hu-HU"/>
+        </w:rPr>
+        <w:drawing>
+          <wp:inline distT="0" distB="0" distL="0" distR="0" wp14:anchorId="7AB982F0" wp14:editId="7113E090">
+            <wp:extent cx="5760720" cy="2723515"/>
+            <wp:effectExtent l="0" t="0" r="0" b="635"/>
+            <wp:docPr id="4" name="Kép 4"/>
+            <wp:cNvGraphicFramePr>
+              <a:graphicFrameLocks xmlns:a="http://schemas.openxmlformats.org/drawingml/2006/main" noChangeAspect="1"/>
+            </wp:cNvGraphicFramePr>
+            <a:graphic xmlns:a="http://schemas.openxmlformats.org/drawingml/2006/main">
+              <a:graphicData uri="http://schemas.openxmlformats.org/drawingml/2006/picture">
+                <pic:pic xmlns:pic="http://schemas.openxmlformats.org/drawingml/2006/picture">
+                  <pic:nvPicPr>
+                    <pic:cNvPr id="1" name=""/>
+                    <pic:cNvPicPr/>
+                  </pic:nvPicPr>
+                  <pic:blipFill>
+                    <a:blip r:embed="rId23"/>
+                    <a:stretch>
+                      <a:fillRect/>
+                    </a:stretch>
+                  </pic:blipFill>
+                  <pic:spPr>
+                    <a:xfrm>
+                      <a:off x="0" y="0"/>
+                      <a:ext cx="5760720" cy="2723515"/>
+                    </a:xfrm>
+                    <a:prstGeom prst="rect">
+                      <a:avLst/>
+                    </a:prstGeom>
+                  </pic:spPr>
+                </pic:pic>
+              </a:graphicData>
+            </a:graphic>
+          </wp:inline>
+        </w:drawing>
+      </w:r>
+    </w:p>
+    <w:p>
+      <w:pPr>
+        <w:shd w:val="clear" w:color="auto" w:fill="FFFFFF"/>
+        <w:spacing w:line="285" w:lineRule="atLeast"/>
+        <w:rPr>
+          <w:rFonts w:eastAsia="Times New Roman" w:cstheme="minorHAnsi"/>
+          <w:color w:val="202020"/>
+          <w:sz w:val="21"/>
+          <w:szCs w:val="21"/>
+          <w:lang w:eastAsia="hu-HU"/>
+        </w:rPr>
+      </w:pPr>
+    </w:p>
     <w:sectPr>
       <w:pgSz w:w="11906" w:h="16838"/>
       <w:pgMar w:top="1417" w:right="1417" w:bottom="1417" w:left="1417" w:header="708" w:footer="708" w:gutter="0"/>

</xml_diff>